<commit_message>
About the Author (B): Gravitation, Actually (new page at end)
</commit_message>
<xml_diff>
--- a/Gravitation, Actually/Gravitation, Actually  - Rev5.docx
+++ b/Gravitation, Actually/Gravitation, Actually  - Rev5.docx
@@ -19077,6 +19077,52 @@
       </w:pPr>
       <w:r>
         <w:t xml:space="preserve"/>
+      </w:r>
+    </w:p>
+    <w:p>
+      <w:pPr>
+        <w:pStyle w:val="Heading1"/>
+        <w:pBdr>
+          <w:bottom w:val="single" w:color="2E75B6" w:sz="8" w:space="1"/>
+        </w:pBdr>
+        <w:spacing w:after="320" w:before="0"/>
+      </w:pPr>
+      <w:r>
+        <w:rPr>
+          <w:rFonts w:ascii="Aptos" w:cs="Aptos" w:eastAsia="Aptos" w:hAnsi="Aptos"/>
+          <w:b/>
+          <w:bCs/>
+          <w:color w:val="2E75B6"/>
+          <w:sz w:val="30"/>
+          <w:szCs w:val="30"/>
+        </w:rPr>
+        <w:t xml:space="preserve">About the Author</w:t>
+      </w:r>
+    </w:p>
+    <w:p>
+      <w:pPr>
+        <w:spacing w:after="160" w:line="360"/>
+      </w:pPr>
+      <w:r>
+        <w:rPr>
+          <w:rFonts w:ascii="Aptos" w:cs="Aptos" w:eastAsia="Aptos" w:hAnsi="Aptos"/>
+          <w:sz w:val="24"/>
+          <w:szCs w:val="24"/>
+        </w:rPr>
+        <w:t xml:space="preserve">Lothar J. Musiol is a graduate of Munich University of Applied Sciences who spent more than forty years in the semiconductor industry, first at Germany’s largest company in the field, then at a string of American start-ups. He studied physics alongside all of it, seriously enough to know exactly how much he is simplifying. Dual citizenship, put to its most sensible use, lets him split his time between San Clemente, California, and Passau, Bavaria, where Austria begins at the garden fence. The household includes one married daughter, one grumpy Teacup Pomeranian named Gucci, and eleven chickens, listed in order of seniority rather than volume.</w:t>
+      </w:r>
+    </w:p>
+    <w:p>
+      <w:pPr>
+        <w:spacing w:after="160" w:line="360"/>
+      </w:pPr>
+      <w:r>
+        <w:rPr>
+          <w:rFonts w:ascii="Aptos" w:cs="Aptos" w:eastAsia="Aptos" w:hAnsi="Aptos"/>
+          <w:sz w:val="24"/>
+          <w:szCs w:val="24"/>
+        </w:rPr>
+        <w:t xml:space="preserve">He writes to make complex ideas clearer and more engaging than most treatments manage, without ever pretending they are simpler than they actually are.</w:t>
       </w:r>
     </w:p>
     <w:sectPr>

</xml_diff>

<commit_message>
About the Author (B): Gravitation, Actually (new page at end) [merged onto main from book-2-lectures-after-qed 066bd5d, paths only]
</commit_message>
<xml_diff>
--- a/Gravitation, Actually/Gravitation, Actually  - Rev5.docx
+++ b/Gravitation, Actually/Gravitation, Actually  - Rev5.docx
@@ -19077,6 +19077,52 @@
       </w:pPr>
       <w:r>
         <w:t xml:space="preserve"/>
+      </w:r>
+    </w:p>
+    <w:p>
+      <w:pPr>
+        <w:pStyle w:val="Heading1"/>
+        <w:pBdr>
+          <w:bottom w:val="single" w:color="2E75B6" w:sz="8" w:space="1"/>
+        </w:pBdr>
+        <w:spacing w:after="320" w:before="0"/>
+      </w:pPr>
+      <w:r>
+        <w:rPr>
+          <w:rFonts w:ascii="Aptos" w:cs="Aptos" w:eastAsia="Aptos" w:hAnsi="Aptos"/>
+          <w:b/>
+          <w:bCs/>
+          <w:color w:val="2E75B6"/>
+          <w:sz w:val="30"/>
+          <w:szCs w:val="30"/>
+        </w:rPr>
+        <w:t xml:space="preserve">About the Author</w:t>
+      </w:r>
+    </w:p>
+    <w:p>
+      <w:pPr>
+        <w:spacing w:after="160" w:line="360"/>
+      </w:pPr>
+      <w:r>
+        <w:rPr>
+          <w:rFonts w:ascii="Aptos" w:cs="Aptos" w:eastAsia="Aptos" w:hAnsi="Aptos"/>
+          <w:sz w:val="24"/>
+          <w:szCs w:val="24"/>
+        </w:rPr>
+        <w:t xml:space="preserve">Lothar J. Musiol is a graduate of Munich University of Applied Sciences who spent more than forty years in the semiconductor industry, first at Germany’s largest company in the field, then at a string of American start-ups. He studied physics alongside all of it, seriously enough to know exactly how much he is simplifying. Dual citizenship, put to its most sensible use, lets him split his time between San Clemente, California, and Passau, Bavaria, where Austria begins at the garden fence. The household includes one married daughter, one grumpy Teacup Pomeranian named Gucci, and eleven chickens, listed in order of seniority rather than volume.</w:t>
+      </w:r>
+    </w:p>
+    <w:p>
+      <w:pPr>
+        <w:spacing w:after="160" w:line="360"/>
+      </w:pPr>
+      <w:r>
+        <w:rPr>
+          <w:rFonts w:ascii="Aptos" w:cs="Aptos" w:eastAsia="Aptos" w:hAnsi="Aptos"/>
+          <w:sz w:val="24"/>
+          <w:szCs w:val="24"/>
+        </w:rPr>
+        <w:t xml:space="preserve">He writes to make complex ideas clearer and more engaging than most treatments manage, without ever pretending they are simpler than they actually are.</w:t>
       </w:r>
     </w:p>
     <w:sectPr>

</xml_diff>

<commit_message>
TOC complete and linked + review invitation: Gravitation, Actually
</commit_message>
<xml_diff>
--- a/Gravitation, Actually/Gravitation, Actually  - Rev5.docx
+++ b/Gravitation, Actually/Gravitation, Actually  - Rev5.docx
@@ -401,6 +401,102 @@
             <w:szCs w:val="24"/>
           </w:rPr>
           <w:t xml:space="preserve">Bibliography</w:t>
+        </w:r>
+      </w:hyperlink>
+    </w:p>
+    <w:p>
+      <w:pPr>
+        <w:spacing w:after="140" w:before="140"/>
+      </w:pPr>
+      <w:hyperlink w:history="1" w:anchor="the-steps-the-argument-needs">
+        <w:r>
+          <w:rPr>
+            <w:rFonts w:ascii="Aptos" w:cs="Aptos" w:eastAsia="Aptos" w:hAnsi="Aptos"/>
+            <w:color w:val="2E75B6"/>
+            <w:sz w:val="24"/>
+            <w:szCs w:val="24"/>
+          </w:rPr>
+          <w:t xml:space="preserve">The steps the argument needs</w:t>
+        </w:r>
+      </w:hyperlink>
+    </w:p>
+    <w:p>
+      <w:pPr>
+        <w:spacing w:after="140" w:before="140"/>
+      </w:pPr>
+      <w:hyperlink w:history="1" w:anchor="worked-checks">
+        <w:r>
+          <w:rPr>
+            <w:rFonts w:ascii="Aptos" w:cs="Aptos" w:eastAsia="Aptos" w:hAnsi="Aptos"/>
+            <w:color w:val="2E75B6"/>
+            <w:sz w:val="24"/>
+            <w:szCs w:val="24"/>
+          </w:rPr>
+          <w:t xml:space="preserve">Worked checks</w:t>
+        </w:r>
+      </w:hyperlink>
+    </w:p>
+    <w:p>
+      <w:pPr>
+        <w:spacing w:after="140" w:before="140"/>
+      </w:pPr>
+      <w:hyperlink w:history="1" w:anchor="the-budget-as-numbers">
+        <w:r>
+          <w:rPr>
+            <w:rFonts w:ascii="Aptos" w:cs="Aptos" w:eastAsia="Aptos" w:hAnsi="Aptos"/>
+            <w:color w:val="2E75B6"/>
+            <w:sz w:val="24"/>
+            <w:szCs w:val="24"/>
+          </w:rPr>
+          <w:t xml:space="preserve">The budget, as numbers</w:t>
+        </w:r>
+      </w:hyperlink>
+    </w:p>
+    <w:p>
+      <w:pPr>
+        <w:spacing w:after="140" w:before="140"/>
+      </w:pPr>
+      <w:hyperlink w:history="1" w:anchor="necessary-essays">
+        <w:r>
+          <w:rPr>
+            <w:rFonts w:ascii="Aptos" w:cs="Aptos" w:eastAsia="Aptos" w:hAnsi="Aptos"/>
+            <w:color w:val="2E75B6"/>
+            <w:sz w:val="24"/>
+            <w:szCs w:val="24"/>
+          </w:rPr>
+          <w:t xml:space="preserve">Necessary essays</w:t>
+        </w:r>
+      </w:hyperlink>
+    </w:p>
+    <w:p>
+      <w:pPr>
+        <w:spacing w:after="140" w:before="140"/>
+      </w:pPr>
+      <w:hyperlink w:history="1" w:anchor="checks-with-their-own-numbers">
+        <w:r>
+          <w:rPr>
+            <w:rFonts w:ascii="Aptos" w:cs="Aptos" w:eastAsia="Aptos" w:hAnsi="Aptos"/>
+            <w:color w:val="2E75B6"/>
+            <w:sz w:val="24"/>
+            <w:szCs w:val="24"/>
+          </w:rPr>
+          <w:t xml:space="preserve">Checks with their own numbers</w:t>
+        </w:r>
+      </w:hyperlink>
+    </w:p>
+    <w:p>
+      <w:pPr>
+        <w:spacing w:after="140" w:before="140"/>
+      </w:pPr>
+      <w:hyperlink w:history="1" w:anchor="_TocAll0001">
+        <w:r>
+          <w:rPr>
+            <w:rFonts w:ascii="Aptos" w:cs="Aptos" w:eastAsia="Aptos" w:hAnsi="Aptos"/>
+            <w:color w:val="2E75B6"/>
+            <w:sz w:val="24"/>
+            <w:szCs w:val="24"/>
+          </w:rPr>
+          <w:t xml:space="preserve">About the Author</w:t>
         </w:r>
       </w:hyperlink>
     </w:p>
@@ -19081,12 +19177,35 @@
     </w:p>
     <w:p>
       <w:pPr>
+        <w:pageBreakBefore/>
+        <w:spacing w:after="160" w:line="360"/>
+      </w:pPr>
+      <w:r>
+        <w:rPr>
+          <w:rFonts w:ascii="Aptos" w:cs="Aptos" w:eastAsia="Aptos" w:hAnsi="Aptos"/>
+          <w:sz w:val="24"/>
+          <w:szCs w:val="24"/>
+          <w:i/>
+          <w:iCs/>
+        </w:rPr>
+        <w:t xml:space="preserve">If this book gave you something, a laugh, an idea, or a better question, I’d love to hear about it. A short review on Amazon, even a sentence or two, helps other curious readers find it, and I read every one.</w:t>
+      </w:r>
+    </w:p>
+    <w:p>
+      <w:r>
+        <w:br w:type="page"/>
+      </w:r>
+    </w:p>
+    <w:p>
+      <w:pPr>
         <w:pStyle w:val="Heading1"/>
         <w:pBdr>
           <w:bottom w:val="single" w:color="2E75B6" w:sz="8" w:space="1"/>
         </w:pBdr>
         <w:spacing w:after="320" w:before="0"/>
       </w:pPr>
+      <w:bookmarkStart w:id="102" w:name="_TocAll0001"/>
+      <w:bookmarkEnd w:id="102"/>
       <w:r>
         <w:rPr>
           <w:rFonts w:ascii="Aptos" w:cs="Aptos" w:eastAsia="Aptos" w:hAnsi="Aptos"/>

</xml_diff>

<commit_message>
TOC complete and linked + review invitation: Gravitation, Actually [merged onto main from book-2-lectures-after-qed ebcf7a7, paths only]
</commit_message>
<xml_diff>
--- a/Gravitation, Actually/Gravitation, Actually  - Rev5.docx
+++ b/Gravitation, Actually/Gravitation, Actually  - Rev5.docx
@@ -401,6 +401,102 @@
             <w:szCs w:val="24"/>
           </w:rPr>
           <w:t xml:space="preserve">Bibliography</w:t>
+        </w:r>
+      </w:hyperlink>
+    </w:p>
+    <w:p>
+      <w:pPr>
+        <w:spacing w:after="140" w:before="140"/>
+      </w:pPr>
+      <w:hyperlink w:history="1" w:anchor="the-steps-the-argument-needs">
+        <w:r>
+          <w:rPr>
+            <w:rFonts w:ascii="Aptos" w:cs="Aptos" w:eastAsia="Aptos" w:hAnsi="Aptos"/>
+            <w:color w:val="2E75B6"/>
+            <w:sz w:val="24"/>
+            <w:szCs w:val="24"/>
+          </w:rPr>
+          <w:t xml:space="preserve">The steps the argument needs</w:t>
+        </w:r>
+      </w:hyperlink>
+    </w:p>
+    <w:p>
+      <w:pPr>
+        <w:spacing w:after="140" w:before="140"/>
+      </w:pPr>
+      <w:hyperlink w:history="1" w:anchor="worked-checks">
+        <w:r>
+          <w:rPr>
+            <w:rFonts w:ascii="Aptos" w:cs="Aptos" w:eastAsia="Aptos" w:hAnsi="Aptos"/>
+            <w:color w:val="2E75B6"/>
+            <w:sz w:val="24"/>
+            <w:szCs w:val="24"/>
+          </w:rPr>
+          <w:t xml:space="preserve">Worked checks</w:t>
+        </w:r>
+      </w:hyperlink>
+    </w:p>
+    <w:p>
+      <w:pPr>
+        <w:spacing w:after="140" w:before="140"/>
+      </w:pPr>
+      <w:hyperlink w:history="1" w:anchor="the-budget-as-numbers">
+        <w:r>
+          <w:rPr>
+            <w:rFonts w:ascii="Aptos" w:cs="Aptos" w:eastAsia="Aptos" w:hAnsi="Aptos"/>
+            <w:color w:val="2E75B6"/>
+            <w:sz w:val="24"/>
+            <w:szCs w:val="24"/>
+          </w:rPr>
+          <w:t xml:space="preserve">The budget, as numbers</w:t>
+        </w:r>
+      </w:hyperlink>
+    </w:p>
+    <w:p>
+      <w:pPr>
+        <w:spacing w:after="140" w:before="140"/>
+      </w:pPr>
+      <w:hyperlink w:history="1" w:anchor="necessary-essays">
+        <w:r>
+          <w:rPr>
+            <w:rFonts w:ascii="Aptos" w:cs="Aptos" w:eastAsia="Aptos" w:hAnsi="Aptos"/>
+            <w:color w:val="2E75B6"/>
+            <w:sz w:val="24"/>
+            <w:szCs w:val="24"/>
+          </w:rPr>
+          <w:t xml:space="preserve">Necessary essays</w:t>
+        </w:r>
+      </w:hyperlink>
+    </w:p>
+    <w:p>
+      <w:pPr>
+        <w:spacing w:after="140" w:before="140"/>
+      </w:pPr>
+      <w:hyperlink w:history="1" w:anchor="checks-with-their-own-numbers">
+        <w:r>
+          <w:rPr>
+            <w:rFonts w:ascii="Aptos" w:cs="Aptos" w:eastAsia="Aptos" w:hAnsi="Aptos"/>
+            <w:color w:val="2E75B6"/>
+            <w:sz w:val="24"/>
+            <w:szCs w:val="24"/>
+          </w:rPr>
+          <w:t xml:space="preserve">Checks with their own numbers</w:t>
+        </w:r>
+      </w:hyperlink>
+    </w:p>
+    <w:p>
+      <w:pPr>
+        <w:spacing w:after="140" w:before="140"/>
+      </w:pPr>
+      <w:hyperlink w:history="1" w:anchor="_TocAll0001">
+        <w:r>
+          <w:rPr>
+            <w:rFonts w:ascii="Aptos" w:cs="Aptos" w:eastAsia="Aptos" w:hAnsi="Aptos"/>
+            <w:color w:val="2E75B6"/>
+            <w:sz w:val="24"/>
+            <w:szCs w:val="24"/>
+          </w:rPr>
+          <w:t xml:space="preserve">About the Author</w:t>
         </w:r>
       </w:hyperlink>
     </w:p>
@@ -19081,12 +19177,35 @@
     </w:p>
     <w:p>
       <w:pPr>
+        <w:pageBreakBefore/>
+        <w:spacing w:after="160" w:line="360"/>
+      </w:pPr>
+      <w:r>
+        <w:rPr>
+          <w:rFonts w:ascii="Aptos" w:cs="Aptos" w:eastAsia="Aptos" w:hAnsi="Aptos"/>
+          <w:sz w:val="24"/>
+          <w:szCs w:val="24"/>
+          <w:i/>
+          <w:iCs/>
+        </w:rPr>
+        <w:t xml:space="preserve">If this book gave you something, a laugh, an idea, or a better question, I’d love to hear about it. A short review on Amazon, even a sentence or two, helps other curious readers find it, and I read every one.</w:t>
+      </w:r>
+    </w:p>
+    <w:p>
+      <w:r>
+        <w:br w:type="page"/>
+      </w:r>
+    </w:p>
+    <w:p>
+      <w:pPr>
         <w:pStyle w:val="Heading1"/>
         <w:pBdr>
           <w:bottom w:val="single" w:color="2E75B6" w:sz="8" w:space="1"/>
         </w:pBdr>
         <w:spacing w:after="320" w:before="0"/>
       </w:pPr>
+      <w:bookmarkStart w:id="102" w:name="_TocAll0001"/>
+      <w:bookmarkEnd w:id="102"/>
       <w:r>
         <w:rPr>
           <w:rFonts w:ascii="Aptos" w:cs="Aptos" w:eastAsia="Aptos" w:hAnsi="Aptos"/>

</xml_diff>